<commit_message>
docs(juridico): ofício 203/2026 recebido em 28/08 — prazo até 11/09/2026
Co-Authored-By: Claude Opus 5 <noreply@anthropic.com>
</commit_message>
<xml_diff>
--- a/docs/juridico/mpe-pp-906-2026/minuta-resposta-oficio-203.docx
+++ b/docs/juridico/mpe-pp-906-2026/minuta-resposta-oficio-203.docx
@@ -72,7 +72,79 @@
           <w:iCs/>
           <w:color w:val="555555"/>
         </w:rPr>
-        <w:t xml:space="preserve"> contados do primeiro recebimento do ofício. Protocolo pela plataforma de serviços eletrônicos do MPF (http://www.mpf.mp.br/mpfservicos), mencionando o número do procedimento e o do ofício.</w:t>
+        <w:t xml:space="preserve"> contados do primeiro recebimento, ocorrido em </w:t>
+      </w:r>
+      <w:r>
+        <w:rPr>
+          <w:b/>
+          <w:bCs/>
+          <w:i/>
+          <w:iCs/>
+          <w:color w:val="555555"/>
+        </w:rPr>
+        <w:t xml:space="preserve">28/08/2026</w:t>
+      </w:r>
+      <w:r>
+        <w:rPr>
+          <w:i/>
+          <w:iCs/>
+          <w:color w:val="555555"/>
+        </w:rPr>
+        <w:t xml:space="preserve"> (sexta-feira) — vencimento em </w:t>
+      </w:r>
+      <w:r>
+        <w:rPr>
+          <w:b/>
+          <w:bCs/>
+          <w:i/>
+          <w:iCs/>
+          <w:color w:val="555555"/>
+        </w:rPr>
+        <w:t xml:space="preserve">11/09/2026</w:t>
+      </w:r>
+      <w:r>
+        <w:rPr>
+          <w:i/>
+          <w:iCs/>
+          <w:color w:val="555555"/>
+        </w:rPr>
+        <w:t xml:space="preserve">, na contagem que inclui o dia do recebimento, ou em </w:t>
+      </w:r>
+      <w:r>
+        <w:rPr>
+          <w:b/>
+          <w:bCs/>
+          <w:i/>
+          <w:iCs/>
+          <w:color w:val="555555"/>
+        </w:rPr>
+        <w:t xml:space="preserve">14/09/2026</w:t>
+      </w:r>
+      <w:r>
+        <w:rPr>
+          <w:i/>
+          <w:iCs/>
+          <w:color w:val="555555"/>
+        </w:rPr>
+        <w:t xml:space="preserve">, se contado do dia útil seguinte (feriado de 07/09 excluído). </w:t>
+      </w:r>
+      <w:r>
+        <w:rPr>
+          <w:b/>
+          <w:bCs/>
+          <w:i/>
+          <w:iCs/>
+          <w:color w:val="555555"/>
+        </w:rPr>
+        <w:t xml:space="preserve">Adotar 11/09/2026.</w:t>
+      </w:r>
+      <w:r>
+        <w:rPr>
+          <w:i/>
+          <w:iCs/>
+          <w:color w:val="555555"/>
+        </w:rPr>
+        <w:t xml:space="preserve"> Protocolo pela plataforma de serviços eletrônicos do MPF (http://www.mpf.mp.br/mpfservicos), mencionando o número do procedimento e o do ofício.</w:t>
       </w:r>
     </w:p>
     <w:p>
@@ -193,7 +265,7 @@
           <w:b/>
           <w:bCs/>
         </w:rPr>
-        <w:t xml:space="preserve">[dd/mm/2026]</w:t>
+        <w:t xml:space="preserve">28/08/2026</w:t>
       </w:r>
       <w:r>
         <w:t xml:space="preserve">, vem, tempestivamente e com toda a consideração, prestar os esclarecimentos requisitados, nos seguintes termos.</w:t>
@@ -3333,7 +3405,17 @@
         <w:spacing w:after="40"/>
       </w:pPr>
       <w:r>
-        <w:t xml:space="preserve">[ ] Data do primeiro recebimento do ofício preenchida e prazo de 10 dias úteis conferido</w:t>
+        <w:t xml:space="preserve">[x] Recebimento em 28/08/2026; prazo até </w:t>
+      </w:r>
+      <w:r>
+        <w:rPr>
+          <w:b/>
+          <w:bCs/>
+        </w:rPr>
+        <w:t xml:space="preserve">11/09/2026</w:t>
+      </w:r>
+      <w:r>
+        <w:t xml:space="preserve"> (contagem conservadora)</w:t>
       </w:r>
     </w:p>
     <w:p>

</xml_diff>